<commit_message>
Documentación: el sistema queda publicado en https://taller.navmac.com
</commit_message>
<xml_diff>
--- a/documentacion/Como_correr.docx
+++ b/documentacion/Como_correr.docx
@@ -652,8 +652,34 @@
           <w:sz w:val="18"/>
           <w:szCs w:val="18"/>
         </w:rPr>
-        <w:t xml:space="preserve">http://148.113.167.5
+        <w:t xml:space="preserve">https://taller.navmac.com
 </w:t>
+      </w:r>
+    </w:p>
+    <w:p>
+      <w:pPr>
+        <w:spacing w:after="160" w:line="276"/>
+      </w:pPr>
+      <w:r>
+        <w:rPr>
+          <w:rFonts w:ascii="Calibri" w:cs="Calibri" w:eastAsia="Calibri" w:hAnsi="Calibri"/>
+        </w:rPr>
+        <w:t xml:space="preserve">También responde por la IP del servidor, </w:t>
+      </w:r>
+      <w:r>
+        <w:rPr>
+          <w:rFonts w:ascii="Consolas" w:cs="Consolas" w:eastAsia="Consolas" w:hAnsi="Consolas"/>
+          <w:sz w:val="20"/>
+          <w:szCs w:val="20"/>
+          <w:shd w:fill="EEEEEE" w:val="clear"/>
+        </w:rPr>
+        <w:t xml:space="preserve">http://148.113.167.5</w:t>
+      </w:r>
+      <w:r>
+        <w:rPr>
+          <w:rFonts w:ascii="Calibri" w:cs="Calibri" w:eastAsia="Calibri" w:hAnsi="Calibri"/>
+        </w:rPr>
+        <w:t xml:space="preserve">.</w:t>
       </w:r>
     </w:p>
     <w:p>

</xml_diff>